<commit_message>
some dsa questions and input validation in express with express-validator and zod
</commit_message>
<xml_diff>
--- a/interview questions/3.javascript.docx
+++ b/interview questions/3.javascript.docx
@@ -286,12 +286,6 @@
         <w:spacing w:line="240" w:lineRule="auto"/>
         <w:jc w:val="both"/>
       </w:pPr>
-    </w:p>
-    <w:p>
-      <w:pPr>
-        <w:spacing w:line="240" w:lineRule="auto"/>
-        <w:jc w:val="both"/>
-      </w:pPr>
       <w:r>
         <w:t>let b = 20;</w:t>
       </w:r>
@@ -471,6 +465,7 @@
         <w:jc w:val="both"/>
       </w:pPr>
       <w:r>
+        <w:lastRenderedPageBreak/>
         <w:t>var a = 10;</w:t>
       </w:r>
     </w:p>
@@ -840,7 +835,6 @@
         <w:jc w:val="both"/>
       </w:pPr>
       <w:r>
-        <w:lastRenderedPageBreak/>
         <w:t>}</w:t>
       </w:r>
     </w:p>
@@ -1212,16 +1206,16 @@
         <w:jc w:val="both"/>
       </w:pPr>
       <w:r>
+        <w:t>console.log("C");</w:t>
+      </w:r>
+    </w:p>
+    <w:p>
+      <w:pPr>
+        <w:spacing w:line="240" w:lineRule="auto"/>
+        <w:jc w:val="both"/>
+      </w:pPr>
+      <w:r>
         <w:lastRenderedPageBreak/>
-        <w:t>console.log("C");</w:t>
-      </w:r>
-    </w:p>
-    <w:p>
-      <w:pPr>
-        <w:spacing w:line="240" w:lineRule="auto"/>
-        <w:jc w:val="both"/>
-      </w:pPr>
-      <w:r>
         <w:t>Output:</w:t>
       </w:r>
     </w:p>
@@ -1578,6 +1572,7 @@
         <w:jc w:val="both"/>
       </w:pPr>
       <w:r>
+        <w:lastRenderedPageBreak/>
         <w:t xml:space="preserve">    if (success) {</w:t>
       </w:r>
     </w:p>
@@ -1923,16 +1918,16 @@
         <w:jc w:val="both"/>
       </w:pPr>
       <w:r>
+        <w:t>async/await is used to write asynchronous Promise-based code in a cleaner and more readable way.</w:t>
+      </w:r>
+    </w:p>
+    <w:p>
+      <w:pPr>
+        <w:spacing w:line="240" w:lineRule="auto"/>
+        <w:jc w:val="both"/>
+      </w:pPr>
+      <w:r>
         <w:lastRenderedPageBreak/>
-        <w:t>async/await is used to write asynchronous Promise-based code in a cleaner and more readable way.</w:t>
-      </w:r>
-    </w:p>
-    <w:p>
-      <w:pPr>
-        <w:spacing w:line="240" w:lineRule="auto"/>
-        <w:jc w:val="both"/>
-      </w:pPr>
-      <w:r>
         <w:pict w14:anchorId="1AE3D8C9">
           <v:rect id="_x0000_i1033" style="width:0;height:1.5pt" o:hralign="center" o:hrstd="t" o:hr="t" fillcolor="#a0a0a0" stroked="f"/>
         </w:pict>
@@ -2525,7 +2520,6 @@
               <w:jc w:val="both"/>
             </w:pPr>
             <w:r>
-              <w:lastRenderedPageBreak/>
               <w:t>5</w:t>
             </w:r>
           </w:p>
@@ -2632,6 +2626,7 @@
               <w:jc w:val="both"/>
             </w:pPr>
             <w:r>
+              <w:lastRenderedPageBreak/>
               <w:t>7</w:t>
             </w:r>
           </w:p>
@@ -2833,30 +2828,6 @@
       <w:pPr>
         <w:spacing w:line="240" w:lineRule="auto"/>
         <w:jc w:val="both"/>
-      </w:pPr>
-      <w:r>
-        <w:rPr>
-          <w:b/>
-          <w:bCs/>
-        </w:rPr>
-        <w:t>For a MERN interview, after these 10, the next important topics are:</w:t>
-      </w:r>
-      <w:r>
-        <w:t xml:space="preserve"> this, call/apply/bind, prototypes, inheritance, map/filter/reduce, spread/rest operators, </w:t>
-      </w:r>
-      <w:proofErr w:type="spellStart"/>
-      <w:r>
-        <w:t>destructuring</w:t>
-      </w:r>
-      <w:proofErr w:type="spellEnd"/>
-      <w:r>
-        <w:t>, event delegation, debouncing/throttling, shallow vs deep copy, and execution context.</w:t>
-      </w:r>
-    </w:p>
-    <w:p>
-      <w:pPr>
-        <w:spacing w:line="240" w:lineRule="auto"/>
-        <w:jc w:val="both"/>
         <w:rPr>
           <w:vanish/>
         </w:rPr>
@@ -3184,45 +3155,45 @@
         <w:jc w:val="both"/>
       </w:pPr>
       <w:r>
+        <w:t>};</w:t>
+      </w:r>
+    </w:p>
+    <w:p>
+      <w:pPr>
+        <w:spacing w:line="240" w:lineRule="auto"/>
+        <w:jc w:val="both"/>
+      </w:pPr>
+    </w:p>
+    <w:p>
+      <w:pPr>
+        <w:spacing w:line="240" w:lineRule="auto"/>
+        <w:jc w:val="both"/>
+      </w:pPr>
+      <w:proofErr w:type="spellStart"/>
+      <w:r>
+        <w:t>const</w:t>
+      </w:r>
+      <w:proofErr w:type="spellEnd"/>
+      <w:r>
+        <w:t xml:space="preserve"> user2 = {</w:t>
+      </w:r>
+    </w:p>
+    <w:p>
+      <w:pPr>
+        <w:spacing w:line="240" w:lineRule="auto"/>
+        <w:jc w:val="both"/>
+      </w:pPr>
+      <w:r>
+        <w:t xml:space="preserve">    name: "Rahul"</w:t>
+      </w:r>
+    </w:p>
+    <w:p>
+      <w:pPr>
+        <w:spacing w:line="240" w:lineRule="auto"/>
+        <w:jc w:val="both"/>
+      </w:pPr>
+      <w:r>
         <w:lastRenderedPageBreak/>
-        <w:t>};</w:t>
-      </w:r>
-    </w:p>
-    <w:p>
-      <w:pPr>
-        <w:spacing w:line="240" w:lineRule="auto"/>
-        <w:jc w:val="both"/>
-      </w:pPr>
-    </w:p>
-    <w:p>
-      <w:pPr>
-        <w:spacing w:line="240" w:lineRule="auto"/>
-        <w:jc w:val="both"/>
-      </w:pPr>
-      <w:proofErr w:type="spellStart"/>
-      <w:r>
-        <w:t>const</w:t>
-      </w:r>
-      <w:proofErr w:type="spellEnd"/>
-      <w:r>
-        <w:t xml:space="preserve"> user2 = {</w:t>
-      </w:r>
-    </w:p>
-    <w:p>
-      <w:pPr>
-        <w:spacing w:line="240" w:lineRule="auto"/>
-        <w:jc w:val="both"/>
-      </w:pPr>
-      <w:r>
-        <w:t xml:space="preserve">    name: "Rahul"</w:t>
-      </w:r>
-    </w:p>
-    <w:p>
-      <w:pPr>
-        <w:spacing w:line="240" w:lineRule="auto"/>
-        <w:jc w:val="both"/>
-      </w:pPr>
-      <w:r>
         <w:t>};</w:t>
       </w:r>
     </w:p>
@@ -4112,12 +4083,23 @@
           <w:bCs/>
         </w:rPr>
       </w:pPr>
+    </w:p>
+    <w:p>
+      <w:pPr>
+        <w:spacing w:line="240" w:lineRule="auto"/>
+        <w:jc w:val="both"/>
+        <w:rPr>
+          <w:b/>
+          <w:bCs/>
+        </w:rPr>
+      </w:pPr>
       <w:proofErr w:type="gramStart"/>
       <w:r>
         <w:rPr>
           <w:b/>
           <w:bCs/>
         </w:rPr>
+        <w:lastRenderedPageBreak/>
         <w:t>reduce(</w:t>
       </w:r>
       <w:proofErr w:type="gramEnd"/>
@@ -4480,8 +4462,22 @@
         <w:jc w:val="both"/>
       </w:pPr>
       <w:r>
-        <w:t>console.log(age);</w:t>
-      </w:r>
+        <w:t>console.log(age</w:t>
+      </w:r>
+      <w:proofErr w:type="gramStart"/>
+      <w:r>
+        <w:t>);</w:t>
+      </w:r>
+      <w:r>
+        <w:t>\</w:t>
+      </w:r>
+      <w:proofErr w:type="gramEnd"/>
+    </w:p>
+    <w:p>
+      <w:pPr>
+        <w:spacing w:line="240" w:lineRule="auto"/>
+        <w:jc w:val="both"/>
+      </w:pPr>
     </w:p>
     <w:p>
       <w:pPr>
@@ -4528,47 +4524,41 @@
         <w:spacing w:line="240" w:lineRule="auto"/>
         <w:jc w:val="both"/>
       </w:pPr>
-    </w:p>
-    <w:p>
-      <w:pPr>
-        <w:spacing w:line="240" w:lineRule="auto"/>
-        <w:jc w:val="both"/>
-      </w:pPr>
-      <w:proofErr w:type="spellStart"/>
-      <w:r>
+      <w:proofErr w:type="spellStart"/>
+      <w:r>
+        <w:t>const</w:t>
+      </w:r>
+      <w:proofErr w:type="spellEnd"/>
+      <w:r>
+        <w:t xml:space="preserve"> [a, b, c] = numbers;</w:t>
+      </w:r>
+    </w:p>
+    <w:p>
+      <w:pPr>
+        <w:spacing w:line="240" w:lineRule="auto"/>
+        <w:jc w:val="both"/>
+      </w:pPr>
+      <w:r>
+        <w:t>console.log(a); // 10</w:t>
+      </w:r>
+    </w:p>
+    <w:p>
+      <w:pPr>
+        <w:spacing w:line="240" w:lineRule="auto"/>
+        <w:jc w:val="both"/>
+      </w:pPr>
+    </w:p>
+    <w:p>
+      <w:pPr>
+        <w:spacing w:line="240" w:lineRule="auto"/>
+        <w:jc w:val="both"/>
+      </w:pPr>
+      <w:r>
+        <w:rPr>
+          <w:b/>
+          <w:bCs/>
+        </w:rPr>
         <w:lastRenderedPageBreak/>
-        <w:t>const</w:t>
-      </w:r>
-      <w:proofErr w:type="spellEnd"/>
-      <w:r>
-        <w:t xml:space="preserve"> [a, b, c] = numbers;</w:t>
-      </w:r>
-    </w:p>
-    <w:p>
-      <w:pPr>
-        <w:spacing w:line="240" w:lineRule="auto"/>
-        <w:jc w:val="both"/>
-      </w:pPr>
-    </w:p>
-    <w:p>
-      <w:pPr>
-        <w:spacing w:line="240" w:lineRule="auto"/>
-        <w:jc w:val="both"/>
-      </w:pPr>
-      <w:r>
-        <w:t>console.log(a); // 10</w:t>
-      </w:r>
-    </w:p>
-    <w:p>
-      <w:pPr>
-        <w:spacing w:line="240" w:lineRule="auto"/>
-        <w:jc w:val="both"/>
-      </w:pPr>
-      <w:r>
-        <w:rPr>
-          <w:b/>
-          <w:bCs/>
-        </w:rPr>
         <w:t>Interview Answer:</w:t>
       </w:r>
     </w:p>
@@ -4917,7 +4907,6 @@
           <w:b/>
           <w:bCs/>
         </w:rPr>
-        <w:lastRenderedPageBreak/>
         <w:t>Shallow Copy:</w:t>
       </w:r>
       <w:r>
@@ -4954,6 +4943,7 @@
         <w:jc w:val="both"/>
       </w:pPr>
       <w:r>
+        <w:lastRenderedPageBreak/>
         <w:t xml:space="preserve">    address: {</w:t>
       </w:r>
     </w:p>
@@ -5306,52 +5296,52 @@
         <w:jc w:val="both"/>
       </w:pPr>
       <w:r>
+        <w:t>};</w:t>
+      </w:r>
+    </w:p>
+    <w:p>
+      <w:pPr>
+        <w:spacing w:line="240" w:lineRule="auto"/>
+        <w:jc w:val="both"/>
+      </w:pPr>
+    </w:p>
+    <w:p>
+      <w:pPr>
+        <w:spacing w:line="240" w:lineRule="auto"/>
+        <w:jc w:val="both"/>
+      </w:pPr>
+      <w:proofErr w:type="spellStart"/>
+      <w:r>
+        <w:t>const</w:t>
+      </w:r>
+      <w:proofErr w:type="spellEnd"/>
+      <w:r>
+        <w:t xml:space="preserve"> student = </w:t>
+      </w:r>
+      <w:proofErr w:type="spellStart"/>
+      <w:r>
+        <w:t>Object.create</w:t>
+      </w:r>
+      <w:proofErr w:type="spellEnd"/>
+      <w:r>
+        <w:t>(person);</w:t>
+      </w:r>
+    </w:p>
+    <w:p>
+      <w:pPr>
+        <w:spacing w:line="240" w:lineRule="auto"/>
+        <w:jc w:val="both"/>
+      </w:pPr>
+    </w:p>
+    <w:p>
+      <w:pPr>
+        <w:spacing w:line="240" w:lineRule="auto"/>
+        <w:jc w:val="both"/>
+      </w:pPr>
+      <w:proofErr w:type="spellStart"/>
+      <w:proofErr w:type="gramStart"/>
+      <w:r>
         <w:lastRenderedPageBreak/>
-        <w:t>};</w:t>
-      </w:r>
-    </w:p>
-    <w:p>
-      <w:pPr>
-        <w:spacing w:line="240" w:lineRule="auto"/>
-        <w:jc w:val="both"/>
-      </w:pPr>
-    </w:p>
-    <w:p>
-      <w:pPr>
-        <w:spacing w:line="240" w:lineRule="auto"/>
-        <w:jc w:val="both"/>
-      </w:pPr>
-      <w:proofErr w:type="spellStart"/>
-      <w:r>
-        <w:t>const</w:t>
-      </w:r>
-      <w:proofErr w:type="spellEnd"/>
-      <w:r>
-        <w:t xml:space="preserve"> student = </w:t>
-      </w:r>
-      <w:proofErr w:type="spellStart"/>
-      <w:r>
-        <w:t>Object.create</w:t>
-      </w:r>
-      <w:proofErr w:type="spellEnd"/>
-      <w:r>
-        <w:t>(person);</w:t>
-      </w:r>
-    </w:p>
-    <w:p>
-      <w:pPr>
-        <w:spacing w:line="240" w:lineRule="auto"/>
-        <w:jc w:val="both"/>
-      </w:pPr>
-    </w:p>
-    <w:p>
-      <w:pPr>
-        <w:spacing w:line="240" w:lineRule="auto"/>
-        <w:jc w:val="both"/>
-      </w:pPr>
-      <w:proofErr w:type="spellStart"/>
-      <w:proofErr w:type="gramStart"/>
-      <w:r>
         <w:t>student.greet</w:t>
       </w:r>
       <w:proofErr w:type="spellEnd"/>
@@ -5678,7 +5668,6 @@
           <w:b/>
           <w:bCs/>
         </w:rPr>
-        <w:lastRenderedPageBreak/>
         <w:t>Answer:</w:t>
       </w:r>
       <w:r>
@@ -5741,6 +5730,7 @@
         <w:jc w:val="both"/>
       </w:pPr>
       <w:r>
+        <w:lastRenderedPageBreak/>
         <w:t xml:space="preserve">Input validation </w:t>
       </w:r>
     </w:p>
@@ -6054,7 +6044,6 @@
           <w:b/>
           <w:bCs/>
         </w:rPr>
-        <w:lastRenderedPageBreak/>
         <w:t>Answer:</w:t>
       </w:r>
       <w:r>
@@ -6168,6 +6157,7 @@
         <w:jc w:val="both"/>
       </w:pPr>
       <w:r>
+        <w:lastRenderedPageBreak/>
         <w:t xml:space="preserve">    </w:t>
       </w:r>
       <w:proofErr w:type="gramStart"/>
@@ -6244,7 +6234,7 @@
       </w:pPr>
       <w:r>
         <w:pict w14:anchorId="21F2EEE4">
-          <v:rect id="_x0000_i1104" style="width:0;height:1.5pt" o:hralign="center" o:hrstd="t" o:hr="t" fillcolor="#a0a0a0" stroked="f"/>
+          <v:rect id="_x0000_i1044" style="width:0;height:1.5pt" o:hralign="center" o:hrstd="t" o:hr="t" fillcolor="#a0a0a0" stroked="f"/>
         </w:pict>
       </w:r>
     </w:p>
@@ -6420,16 +6410,70 @@
         <w:jc w:val="both"/>
       </w:pPr>
       <w:r>
+        <w:t>Capturing Phase</w:t>
+      </w:r>
+    </w:p>
+    <w:p>
+      <w:pPr>
+        <w:spacing w:line="240" w:lineRule="auto"/>
+        <w:jc w:val="both"/>
+      </w:pPr>
+      <w:r>
+        <w:t xml:space="preserve">      ↓</w:t>
+      </w:r>
+    </w:p>
+    <w:p>
+      <w:pPr>
+        <w:spacing w:line="240" w:lineRule="auto"/>
+        <w:jc w:val="both"/>
+      </w:pPr>
+      <w:r>
+        <w:t xml:space="preserve">   Parent</w:t>
+      </w:r>
+    </w:p>
+    <w:p>
+      <w:pPr>
+        <w:spacing w:line="240" w:lineRule="auto"/>
+        <w:jc w:val="both"/>
+      </w:pPr>
+      <w:r>
+        <w:t xml:space="preserve">      ↓</w:t>
+      </w:r>
+    </w:p>
+    <w:p>
+      <w:pPr>
+        <w:spacing w:line="240" w:lineRule="auto"/>
+        <w:jc w:val="both"/>
+      </w:pPr>
+      <w:r>
+        <w:t xml:space="preserve">    Child</w:t>
+      </w:r>
+    </w:p>
+    <w:p>
+      <w:pPr>
+        <w:spacing w:line="240" w:lineRule="auto"/>
+        <w:jc w:val="both"/>
+      </w:pPr>
+      <w:r>
+        <w:t xml:space="preserve">      ↓</w:t>
+      </w:r>
+    </w:p>
+    <w:p>
+      <w:pPr>
+        <w:spacing w:line="240" w:lineRule="auto"/>
+        <w:jc w:val="both"/>
+      </w:pPr>
+      <w:r>
+        <w:t>Target Phase</w:t>
+      </w:r>
+    </w:p>
+    <w:p>
+      <w:pPr>
+        <w:spacing w:line="240" w:lineRule="auto"/>
+        <w:jc w:val="both"/>
+      </w:pPr>
+      <w:r>
         <w:lastRenderedPageBreak/>
-        <w:t>Capturing Phase</w:t>
-      </w:r>
-    </w:p>
-    <w:p>
-      <w:pPr>
-        <w:spacing w:line="240" w:lineRule="auto"/>
-        <w:jc w:val="both"/>
-      </w:pPr>
-      <w:r>
         <w:t xml:space="preserve">      ↓</w:t>
       </w:r>
     </w:p>
@@ -6439,6 +6483,24 @@
         <w:jc w:val="both"/>
       </w:pPr>
       <w:r>
+        <w:t>Bubbling Phase</w:t>
+      </w:r>
+    </w:p>
+    <w:p>
+      <w:pPr>
+        <w:spacing w:line="240" w:lineRule="auto"/>
+        <w:jc w:val="both"/>
+      </w:pPr>
+      <w:r>
+        <w:t xml:space="preserve">      ↑</w:t>
+      </w:r>
+    </w:p>
+    <w:p>
+      <w:pPr>
+        <w:spacing w:line="240" w:lineRule="auto"/>
+        <w:jc w:val="both"/>
+      </w:pPr>
+      <w:r>
         <w:t xml:space="preserve">   Parent</w:t>
       </w:r>
     </w:p>
@@ -6448,80 +6510,8 @@
         <w:jc w:val="both"/>
       </w:pPr>
       <w:r>
-        <w:t xml:space="preserve">      ↓</w:t>
-      </w:r>
-    </w:p>
-    <w:p>
-      <w:pPr>
-        <w:spacing w:line="240" w:lineRule="auto"/>
-        <w:jc w:val="both"/>
-      </w:pPr>
-      <w:r>
-        <w:t xml:space="preserve">    Child</w:t>
-      </w:r>
-    </w:p>
-    <w:p>
-      <w:pPr>
-        <w:spacing w:line="240" w:lineRule="auto"/>
-        <w:jc w:val="both"/>
-      </w:pPr>
-      <w:r>
-        <w:t xml:space="preserve">      ↓</w:t>
-      </w:r>
-    </w:p>
-    <w:p>
-      <w:pPr>
-        <w:spacing w:line="240" w:lineRule="auto"/>
-        <w:jc w:val="both"/>
-      </w:pPr>
-      <w:r>
-        <w:t>Target Phase</w:t>
-      </w:r>
-    </w:p>
-    <w:p>
-      <w:pPr>
-        <w:spacing w:line="240" w:lineRule="auto"/>
-        <w:jc w:val="both"/>
-      </w:pPr>
-      <w:r>
-        <w:t xml:space="preserve">      ↓</w:t>
-      </w:r>
-    </w:p>
-    <w:p>
-      <w:pPr>
-        <w:spacing w:line="240" w:lineRule="auto"/>
-        <w:jc w:val="both"/>
-      </w:pPr>
-      <w:r>
-        <w:t>Bubbling Phase</w:t>
-      </w:r>
-    </w:p>
-    <w:p>
-      <w:pPr>
-        <w:spacing w:line="240" w:lineRule="auto"/>
-        <w:jc w:val="both"/>
-      </w:pPr>
-      <w:r>
-        <w:t xml:space="preserve">      ↑</w:t>
-      </w:r>
-    </w:p>
-    <w:p>
-      <w:pPr>
-        <w:spacing w:line="240" w:lineRule="auto"/>
-        <w:jc w:val="both"/>
-      </w:pPr>
-      <w:r>
-        <w:t xml:space="preserve">   Parent</w:t>
-      </w:r>
-    </w:p>
-    <w:p>
-      <w:pPr>
-        <w:spacing w:line="240" w:lineRule="auto"/>
-        <w:jc w:val="both"/>
-      </w:pPr>
-      <w:r>
         <w:pict w14:anchorId="7FC365E9">
-          <v:rect id="_x0000_i1105" style="width:0;height:1.5pt" o:hralign="center" o:hrstd="t" o:hr="t" fillcolor="#a0a0a0" stroked="f"/>
+          <v:rect id="_x0000_i1045" style="width:0;height:1.5pt" o:hralign="center" o:hrstd="t" o:hr="t" fillcolor="#a0a0a0" stroked="f"/>
         </w:pict>
       </w:r>
     </w:p>
@@ -6708,9 +6698,8 @@
         <w:jc w:val="both"/>
       </w:pPr>
       <w:r>
-        <w:lastRenderedPageBreak/>
         <w:pict w14:anchorId="0629879F">
-          <v:rect id="_x0000_i1106" style="width:0;height:1.5pt" o:hralign="center" o:hrstd="t" o:hr="t" fillcolor="#a0a0a0" stroked="f"/>
+          <v:rect id="_x0000_i1046" style="width:0;height:1.5pt" o:hralign="center" o:hrstd="t" o:hr="t" fillcolor="#a0a0a0" stroked="f"/>
         </w:pict>
       </w:r>
     </w:p>
@@ -6819,6 +6808,7 @@
       </w:pPr>
       <w:proofErr w:type="gramStart"/>
       <w:r>
+        <w:lastRenderedPageBreak/>
         <w:t>.catch</w:t>
       </w:r>
       <w:proofErr w:type="gramEnd"/>
@@ -7144,78 +7134,78 @@
         <w:jc w:val="both"/>
       </w:pPr>
       <w:r>
+        <w:t>2</w:t>
+      </w:r>
+    </w:p>
+    <w:p>
+      <w:pPr>
+        <w:spacing w:line="240" w:lineRule="auto"/>
+        <w:jc w:val="both"/>
+      </w:pPr>
+      <w:r>
+        <w:rPr>
+          <w:b/>
+          <w:bCs/>
+        </w:rPr>
+        <w:t>Interview Answer:</w:t>
+      </w:r>
+    </w:p>
+    <w:p>
+      <w:pPr>
+        <w:spacing w:line="240" w:lineRule="auto"/>
+        <w:jc w:val="both"/>
+      </w:pPr>
+      <w:r>
+        <w:t xml:space="preserve">After the current synchronous code finishes, microtasks are generally processed before the next </w:t>
+      </w:r>
+      <w:proofErr w:type="spellStart"/>
+      <w:r>
+        <w:t>macrotask</w:t>
+      </w:r>
+      <w:proofErr w:type="spellEnd"/>
+      <w:r>
+        <w:t>.</w:t>
+      </w:r>
+    </w:p>
+    <w:p>
+      <w:pPr>
+        <w:spacing w:line="240" w:lineRule="auto"/>
+        <w:jc w:val="both"/>
+      </w:pPr>
+      <w:r>
+        <w:pict w14:anchorId="02448880">
+          <v:rect id="_x0000_i1047" style="width:0;height:1.5pt" o:hralign="center" o:hrstd="t" o:hr="t" fillcolor="#a0a0a0" stroked="f"/>
+        </w:pict>
+      </w:r>
+    </w:p>
+    <w:p>
+      <w:pPr>
+        <w:spacing w:line="240" w:lineRule="auto"/>
+        <w:jc w:val="both"/>
+        <w:rPr>
+          <w:b/>
+          <w:bCs/>
+        </w:rPr>
+      </w:pPr>
+      <w:r>
+        <w:rPr>
+          <w:b/>
+          <w:bCs/>
+        </w:rPr>
+        <w:t>25. What is Currying in JavaScript?</w:t>
+      </w:r>
+    </w:p>
+    <w:p>
+      <w:pPr>
+        <w:spacing w:line="240" w:lineRule="auto"/>
+        <w:jc w:val="both"/>
+      </w:pPr>
+      <w:r>
+        <w:rPr>
+          <w:b/>
+          <w:bCs/>
+        </w:rPr>
         <w:lastRenderedPageBreak/>
-        <w:t>2</w:t>
-      </w:r>
-    </w:p>
-    <w:p>
-      <w:pPr>
-        <w:spacing w:line="240" w:lineRule="auto"/>
-        <w:jc w:val="both"/>
-      </w:pPr>
-      <w:r>
-        <w:rPr>
-          <w:b/>
-          <w:bCs/>
-        </w:rPr>
-        <w:t>Interview Answer:</w:t>
-      </w:r>
-    </w:p>
-    <w:p>
-      <w:pPr>
-        <w:spacing w:line="240" w:lineRule="auto"/>
-        <w:jc w:val="both"/>
-      </w:pPr>
-      <w:r>
-        <w:t xml:space="preserve">After the current synchronous code finishes, microtasks are generally processed before the next </w:t>
-      </w:r>
-      <w:proofErr w:type="spellStart"/>
-      <w:r>
-        <w:t>macrotask</w:t>
-      </w:r>
-      <w:proofErr w:type="spellEnd"/>
-      <w:r>
-        <w:t>.</w:t>
-      </w:r>
-    </w:p>
-    <w:p>
-      <w:pPr>
-        <w:spacing w:line="240" w:lineRule="auto"/>
-        <w:jc w:val="both"/>
-      </w:pPr>
-      <w:r>
-        <w:pict w14:anchorId="02448880">
-          <v:rect id="_x0000_i1107" style="width:0;height:1.5pt" o:hralign="center" o:hrstd="t" o:hr="t" fillcolor="#a0a0a0" stroked="f"/>
-        </w:pict>
-      </w:r>
-    </w:p>
-    <w:p>
-      <w:pPr>
-        <w:spacing w:line="240" w:lineRule="auto"/>
-        <w:jc w:val="both"/>
-        <w:rPr>
-          <w:b/>
-          <w:bCs/>
-        </w:rPr>
-      </w:pPr>
-      <w:r>
-        <w:rPr>
-          <w:b/>
-          <w:bCs/>
-        </w:rPr>
-        <w:t>25. What is Currying in JavaScript?</w:t>
-      </w:r>
-    </w:p>
-    <w:p>
-      <w:pPr>
-        <w:spacing w:line="240" w:lineRule="auto"/>
-        <w:jc w:val="both"/>
-      </w:pPr>
-      <w:r>
-        <w:rPr>
-          <w:b/>
-          <w:bCs/>
-        </w:rPr>
         <w:t>Answer:</w:t>
       </w:r>
       <w:r>
@@ -7439,7 +7429,7 @@
       </w:pPr>
       <w:r>
         <w:pict w14:anchorId="1A3550A6">
-          <v:rect id="_x0000_i1108" style="width:0;height:1.5pt" o:hralign="center" o:hrstd="t" o:hr="t" fillcolor="#a0a0a0" stroked="f"/>
+          <v:rect id="_x0000_i1048" style="width:0;height:1.5pt" o:hralign="center" o:hrstd="t" o:hr="t" fillcolor="#a0a0a0" stroked="f"/>
         </w:pict>
       </w:r>
     </w:p>
@@ -7486,421 +7476,421 @@
           <w:b/>
           <w:bCs/>
         </w:rPr>
+        <w:t>Answer:</w:t>
+      </w:r>
+      <w:r>
+        <w:br/>
+      </w:r>
+      <w:proofErr w:type="spellStart"/>
+      <w:r>
+        <w:t>Memoization</w:t>
+      </w:r>
+      <w:proofErr w:type="spellEnd"/>
+      <w:r>
+        <w:t xml:space="preserve"> is an optimization technique where we </w:t>
+      </w:r>
+      <w:r>
+        <w:rPr>
+          <w:b/>
+          <w:bCs/>
+        </w:rPr>
+        <w:t>cache the result of a function</w:t>
+      </w:r>
+      <w:r>
+        <w:t xml:space="preserve"> so that repeated calculations can be avoided.</w:t>
+      </w:r>
+    </w:p>
+    <w:p>
+      <w:pPr>
+        <w:spacing w:line="240" w:lineRule="auto"/>
+        <w:jc w:val="both"/>
+      </w:pPr>
+      <w:r>
+        <w:t xml:space="preserve">function </w:t>
+      </w:r>
+      <w:proofErr w:type="spellStart"/>
+      <w:r>
+        <w:t>memoize</w:t>
+      </w:r>
+      <w:proofErr w:type="spellEnd"/>
+      <w:r>
+        <w:t>(</w:t>
+      </w:r>
+      <w:proofErr w:type="spellStart"/>
+      <w:r>
+        <w:t>fn</w:t>
+      </w:r>
+      <w:proofErr w:type="spellEnd"/>
+      <w:r>
+        <w:t>) {</w:t>
+      </w:r>
+    </w:p>
+    <w:p>
+      <w:pPr>
+        <w:spacing w:line="240" w:lineRule="auto"/>
+        <w:jc w:val="both"/>
+      </w:pPr>
+      <w:r>
+        <w:t xml:space="preserve">    </w:t>
+      </w:r>
+      <w:proofErr w:type="spellStart"/>
+      <w:r>
+        <w:t>const</w:t>
+      </w:r>
+      <w:proofErr w:type="spellEnd"/>
+      <w:r>
+        <w:t xml:space="preserve"> cache = {};</w:t>
+      </w:r>
+    </w:p>
+    <w:p>
+      <w:pPr>
+        <w:spacing w:line="240" w:lineRule="auto"/>
+        <w:jc w:val="both"/>
+      </w:pPr>
+    </w:p>
+    <w:p>
+      <w:pPr>
+        <w:spacing w:line="240" w:lineRule="auto"/>
+        <w:jc w:val="both"/>
+      </w:pPr>
+      <w:r>
         <w:lastRenderedPageBreak/>
-        <w:t>Answer:</w:t>
-      </w:r>
-      <w:r>
-        <w:br/>
-      </w:r>
+        <w:t xml:space="preserve">    return function (</w:t>
+      </w:r>
+      <w:proofErr w:type="spellStart"/>
+      <w:r>
+        <w:t>num</w:t>
+      </w:r>
+      <w:proofErr w:type="spellEnd"/>
+      <w:r>
+        <w:t>) {</w:t>
+      </w:r>
+    </w:p>
+    <w:p>
+      <w:pPr>
+        <w:spacing w:line="240" w:lineRule="auto"/>
+        <w:jc w:val="both"/>
+      </w:pPr>
+      <w:r>
+        <w:t xml:space="preserve">        if (cache[</w:t>
+      </w:r>
+      <w:proofErr w:type="spellStart"/>
+      <w:r>
+        <w:t>num</w:t>
+      </w:r>
+      <w:proofErr w:type="spellEnd"/>
+      <w:r>
+        <w:t>]) {</w:t>
+      </w:r>
+    </w:p>
+    <w:p>
+      <w:pPr>
+        <w:spacing w:line="240" w:lineRule="auto"/>
+        <w:jc w:val="both"/>
+      </w:pPr>
+      <w:r>
+        <w:t xml:space="preserve">            return cache[</w:t>
+      </w:r>
+      <w:proofErr w:type="spellStart"/>
+      <w:r>
+        <w:t>num</w:t>
+      </w:r>
+      <w:proofErr w:type="spellEnd"/>
+      <w:r>
+        <w:t>];</w:t>
+      </w:r>
+    </w:p>
+    <w:p>
+      <w:pPr>
+        <w:spacing w:line="240" w:lineRule="auto"/>
+        <w:jc w:val="both"/>
+      </w:pPr>
+      <w:r>
+        <w:t xml:space="preserve">        }</w:t>
+      </w:r>
+    </w:p>
+    <w:p>
+      <w:pPr>
+        <w:spacing w:line="240" w:lineRule="auto"/>
+        <w:jc w:val="both"/>
+      </w:pPr>
+    </w:p>
+    <w:p>
+      <w:pPr>
+        <w:spacing w:line="240" w:lineRule="auto"/>
+        <w:jc w:val="both"/>
+      </w:pPr>
+      <w:r>
+        <w:t xml:space="preserve">        </w:t>
+      </w:r>
+      <w:proofErr w:type="spellStart"/>
+      <w:r>
+        <w:t>const</w:t>
+      </w:r>
+      <w:proofErr w:type="spellEnd"/>
+      <w:r>
+        <w:t xml:space="preserve"> result = </w:t>
+      </w:r>
+      <w:proofErr w:type="spellStart"/>
+      <w:r>
+        <w:t>fn</w:t>
+      </w:r>
+      <w:proofErr w:type="spellEnd"/>
+      <w:r>
+        <w:t>(</w:t>
+      </w:r>
+      <w:proofErr w:type="spellStart"/>
+      <w:r>
+        <w:t>num</w:t>
+      </w:r>
+      <w:proofErr w:type="spellEnd"/>
+      <w:r>
+        <w:t>);</w:t>
+      </w:r>
+    </w:p>
+    <w:p>
+      <w:pPr>
+        <w:spacing w:line="240" w:lineRule="auto"/>
+        <w:jc w:val="both"/>
+      </w:pPr>
+      <w:r>
+        <w:t xml:space="preserve">        cache[</w:t>
+      </w:r>
+      <w:proofErr w:type="spellStart"/>
+      <w:r>
+        <w:t>num</w:t>
+      </w:r>
+      <w:proofErr w:type="spellEnd"/>
+      <w:r>
+        <w:t>] = result;</w:t>
+      </w:r>
+    </w:p>
+    <w:p>
+      <w:pPr>
+        <w:spacing w:line="240" w:lineRule="auto"/>
+        <w:jc w:val="both"/>
+      </w:pPr>
+    </w:p>
+    <w:p>
+      <w:pPr>
+        <w:spacing w:line="240" w:lineRule="auto"/>
+        <w:jc w:val="both"/>
+      </w:pPr>
+      <w:r>
+        <w:t xml:space="preserve">        return result;</w:t>
+      </w:r>
+    </w:p>
+    <w:p>
+      <w:pPr>
+        <w:spacing w:line="240" w:lineRule="auto"/>
+        <w:jc w:val="both"/>
+      </w:pPr>
+      <w:r>
+        <w:t xml:space="preserve">    };</w:t>
+      </w:r>
+    </w:p>
+    <w:p>
+      <w:pPr>
+        <w:spacing w:line="240" w:lineRule="auto"/>
+        <w:jc w:val="both"/>
+      </w:pPr>
+      <w:r>
+        <w:t>}</w:t>
+      </w:r>
+    </w:p>
+    <w:p>
+      <w:pPr>
+        <w:spacing w:line="240" w:lineRule="auto"/>
+        <w:jc w:val="both"/>
+      </w:pPr>
+    </w:p>
+    <w:p>
+      <w:pPr>
+        <w:spacing w:line="240" w:lineRule="auto"/>
+        <w:jc w:val="both"/>
+      </w:pPr>
+      <w:r>
+        <w:t>function square(</w:t>
+      </w:r>
+      <w:proofErr w:type="spellStart"/>
+      <w:r>
+        <w:t>num</w:t>
+      </w:r>
+      <w:proofErr w:type="spellEnd"/>
+      <w:r>
+        <w:t>) {</w:t>
+      </w:r>
+    </w:p>
+    <w:p>
+      <w:pPr>
+        <w:spacing w:line="240" w:lineRule="auto"/>
+        <w:jc w:val="both"/>
+      </w:pPr>
+      <w:r>
+        <w:t xml:space="preserve">    </w:t>
+      </w:r>
+      <w:proofErr w:type="gramStart"/>
+      <w:r>
+        <w:t>console.log(</w:t>
+      </w:r>
+      <w:proofErr w:type="gramEnd"/>
+      <w:r>
+        <w:t>"Calculating...");</w:t>
+      </w:r>
+    </w:p>
+    <w:p>
+      <w:pPr>
+        <w:spacing w:line="240" w:lineRule="auto"/>
+        <w:jc w:val="both"/>
+      </w:pPr>
+      <w:r>
+        <w:t xml:space="preserve">    return </w:t>
+      </w:r>
+      <w:proofErr w:type="spellStart"/>
+      <w:r>
+        <w:t>num</w:t>
+      </w:r>
+      <w:proofErr w:type="spellEnd"/>
+      <w:r>
+        <w:t xml:space="preserve"> * </w:t>
+      </w:r>
+      <w:proofErr w:type="spellStart"/>
+      <w:r>
+        <w:t>num</w:t>
+      </w:r>
+      <w:proofErr w:type="spellEnd"/>
+      <w:r>
+        <w:t>;</w:t>
+      </w:r>
+    </w:p>
+    <w:p>
+      <w:pPr>
+        <w:spacing w:line="240" w:lineRule="auto"/>
+        <w:jc w:val="both"/>
+      </w:pPr>
+      <w:r>
+        <w:t>}</w:t>
+      </w:r>
+    </w:p>
+    <w:p>
+      <w:pPr>
+        <w:spacing w:line="240" w:lineRule="auto"/>
+        <w:jc w:val="both"/>
+      </w:pPr>
+    </w:p>
+    <w:p>
+      <w:pPr>
+        <w:spacing w:line="240" w:lineRule="auto"/>
+        <w:jc w:val="both"/>
+      </w:pPr>
+      <w:proofErr w:type="spellStart"/>
+      <w:r>
+        <w:t>const</w:t>
+      </w:r>
+      <w:proofErr w:type="spellEnd"/>
+      <w:r>
+        <w:t xml:space="preserve"> </w:t>
+      </w:r>
+      <w:proofErr w:type="spellStart"/>
+      <w:r>
+        <w:t>memoizedSquare</w:t>
+      </w:r>
+      <w:proofErr w:type="spellEnd"/>
+      <w:r>
+        <w:t xml:space="preserve"> = </w:t>
+      </w:r>
+      <w:proofErr w:type="spellStart"/>
+      <w:r>
+        <w:t>memoize</w:t>
+      </w:r>
+      <w:proofErr w:type="spellEnd"/>
+      <w:r>
+        <w:t>(square);</w:t>
+      </w:r>
+    </w:p>
+    <w:p>
+      <w:pPr>
+        <w:spacing w:line="240" w:lineRule="auto"/>
+        <w:jc w:val="both"/>
+      </w:pPr>
+    </w:p>
+    <w:p>
+      <w:pPr>
+        <w:spacing w:line="240" w:lineRule="auto"/>
+        <w:jc w:val="both"/>
+      </w:pPr>
+      <w:r>
+        <w:t>console.log(</w:t>
+      </w:r>
+      <w:proofErr w:type="spellStart"/>
+      <w:proofErr w:type="gramStart"/>
+      <w:r>
+        <w:t>memoizedSquare</w:t>
+      </w:r>
+      <w:proofErr w:type="spellEnd"/>
+      <w:r>
+        <w:t>(</w:t>
+      </w:r>
+      <w:proofErr w:type="gramEnd"/>
+      <w:r>
+        <w:t>5));</w:t>
+      </w:r>
+    </w:p>
+    <w:p>
+      <w:pPr>
+        <w:spacing w:line="240" w:lineRule="auto"/>
+        <w:jc w:val="both"/>
+      </w:pPr>
+      <w:r>
+        <w:t>console.log(</w:t>
+      </w:r>
+      <w:proofErr w:type="spellStart"/>
+      <w:proofErr w:type="gramStart"/>
+      <w:r>
+        <w:t>memoizedSquare</w:t>
+      </w:r>
+      <w:proofErr w:type="spellEnd"/>
+      <w:r>
+        <w:t>(</w:t>
+      </w:r>
+      <w:proofErr w:type="gramEnd"/>
+      <w:r>
+        <w:t>5));</w:t>
+      </w:r>
+    </w:p>
+    <w:p>
+      <w:pPr>
+        <w:spacing w:line="240" w:lineRule="auto"/>
+        <w:jc w:val="both"/>
+      </w:pPr>
+      <w:r>
+        <w:t>The second call can use the cached result.</w:t>
+      </w:r>
+    </w:p>
+    <w:p>
+      <w:pPr>
+        <w:spacing w:line="240" w:lineRule="auto"/>
+        <w:jc w:val="both"/>
+      </w:pPr>
+      <w:r>
+        <w:rPr>
+          <w:b/>
+          <w:bCs/>
+        </w:rPr>
+        <w:t>Interview Answer:</w:t>
+      </w:r>
+    </w:p>
+    <w:p>
+      <w:pPr>
+        <w:spacing w:line="240" w:lineRule="auto"/>
+        <w:jc w:val="both"/>
+      </w:pPr>
       <w:proofErr w:type="spellStart"/>
       <w:r>
         <w:t>Memoization</w:t>
       </w:r>
       <w:proofErr w:type="spellEnd"/>
       <w:r>
-        <w:t xml:space="preserve"> is an optimization technique where we </w:t>
-      </w:r>
-      <w:r>
-        <w:rPr>
-          <w:b/>
-          <w:bCs/>
-        </w:rPr>
-        <w:t>cache the result of a function</w:t>
-      </w:r>
-      <w:r>
-        <w:t xml:space="preserve"> so that repeated calculations can be avoided.</w:t>
-      </w:r>
-    </w:p>
-    <w:p>
-      <w:pPr>
-        <w:spacing w:line="240" w:lineRule="auto"/>
-        <w:jc w:val="both"/>
-      </w:pPr>
-      <w:r>
-        <w:t xml:space="preserve">function </w:t>
-      </w:r>
-      <w:proofErr w:type="spellStart"/>
-      <w:r>
-        <w:t>memoize</w:t>
-      </w:r>
-      <w:proofErr w:type="spellEnd"/>
-      <w:r>
-        <w:t>(</w:t>
-      </w:r>
-      <w:proofErr w:type="spellStart"/>
-      <w:r>
-        <w:t>fn</w:t>
-      </w:r>
-      <w:proofErr w:type="spellEnd"/>
-      <w:r>
-        <w:t>) {</w:t>
-      </w:r>
-    </w:p>
-    <w:p>
-      <w:pPr>
-        <w:spacing w:line="240" w:lineRule="auto"/>
-        <w:jc w:val="both"/>
-      </w:pPr>
-      <w:r>
-        <w:t xml:space="preserve">    </w:t>
-      </w:r>
-      <w:proofErr w:type="spellStart"/>
-      <w:r>
-        <w:t>const</w:t>
-      </w:r>
-      <w:proofErr w:type="spellEnd"/>
-      <w:r>
-        <w:t xml:space="preserve"> cache = {};</w:t>
-      </w:r>
-    </w:p>
-    <w:p>
-      <w:pPr>
-        <w:spacing w:line="240" w:lineRule="auto"/>
-        <w:jc w:val="both"/>
-      </w:pPr>
-    </w:p>
-    <w:p>
-      <w:pPr>
-        <w:spacing w:line="240" w:lineRule="auto"/>
-        <w:jc w:val="both"/>
-      </w:pPr>
-      <w:r>
-        <w:t xml:space="preserve">    return function (</w:t>
-      </w:r>
-      <w:proofErr w:type="spellStart"/>
-      <w:r>
-        <w:t>num</w:t>
-      </w:r>
-      <w:proofErr w:type="spellEnd"/>
-      <w:r>
-        <w:t>) {</w:t>
-      </w:r>
-    </w:p>
-    <w:p>
-      <w:pPr>
-        <w:spacing w:line="240" w:lineRule="auto"/>
-        <w:jc w:val="both"/>
-      </w:pPr>
-      <w:r>
-        <w:t xml:space="preserve">        if (cache[</w:t>
-      </w:r>
-      <w:proofErr w:type="spellStart"/>
-      <w:r>
-        <w:t>num</w:t>
-      </w:r>
-      <w:proofErr w:type="spellEnd"/>
-      <w:r>
-        <w:t>]) {</w:t>
-      </w:r>
-    </w:p>
-    <w:p>
-      <w:pPr>
-        <w:spacing w:line="240" w:lineRule="auto"/>
-        <w:jc w:val="both"/>
-      </w:pPr>
-      <w:r>
-        <w:t xml:space="preserve">            return cache[</w:t>
-      </w:r>
-      <w:proofErr w:type="spellStart"/>
-      <w:r>
-        <w:t>num</w:t>
-      </w:r>
-      <w:proofErr w:type="spellEnd"/>
-      <w:r>
-        <w:t>];</w:t>
-      </w:r>
-    </w:p>
-    <w:p>
-      <w:pPr>
-        <w:spacing w:line="240" w:lineRule="auto"/>
-        <w:jc w:val="both"/>
-      </w:pPr>
-      <w:r>
-        <w:t xml:space="preserve">        }</w:t>
-      </w:r>
-    </w:p>
-    <w:p>
-      <w:pPr>
-        <w:spacing w:line="240" w:lineRule="auto"/>
-        <w:jc w:val="both"/>
-      </w:pPr>
-    </w:p>
-    <w:p>
-      <w:pPr>
-        <w:spacing w:line="240" w:lineRule="auto"/>
-        <w:jc w:val="both"/>
-      </w:pPr>
-      <w:r>
-        <w:t xml:space="preserve">        </w:t>
-      </w:r>
-      <w:proofErr w:type="spellStart"/>
-      <w:r>
-        <w:t>const</w:t>
-      </w:r>
-      <w:proofErr w:type="spellEnd"/>
-      <w:r>
-        <w:t xml:space="preserve"> result = </w:t>
-      </w:r>
-      <w:proofErr w:type="spellStart"/>
-      <w:r>
-        <w:t>fn</w:t>
-      </w:r>
-      <w:proofErr w:type="spellEnd"/>
-      <w:r>
-        <w:t>(</w:t>
-      </w:r>
-      <w:proofErr w:type="spellStart"/>
-      <w:r>
-        <w:t>num</w:t>
-      </w:r>
-      <w:proofErr w:type="spellEnd"/>
-      <w:r>
-        <w:t>);</w:t>
-      </w:r>
-    </w:p>
-    <w:p>
-      <w:pPr>
-        <w:spacing w:line="240" w:lineRule="auto"/>
-        <w:jc w:val="both"/>
-      </w:pPr>
-      <w:r>
-        <w:t xml:space="preserve">        cache[</w:t>
-      </w:r>
-      <w:proofErr w:type="spellStart"/>
-      <w:r>
-        <w:t>num</w:t>
-      </w:r>
-      <w:proofErr w:type="spellEnd"/>
-      <w:r>
-        <w:t>] = result;</w:t>
-      </w:r>
-    </w:p>
-    <w:p>
-      <w:pPr>
-        <w:spacing w:line="240" w:lineRule="auto"/>
-        <w:jc w:val="both"/>
-      </w:pPr>
-    </w:p>
-    <w:p>
-      <w:pPr>
-        <w:spacing w:line="240" w:lineRule="auto"/>
-        <w:jc w:val="both"/>
-      </w:pPr>
-      <w:r>
-        <w:t xml:space="preserve">        return result;</w:t>
-      </w:r>
-    </w:p>
-    <w:p>
-      <w:pPr>
-        <w:spacing w:line="240" w:lineRule="auto"/>
-        <w:jc w:val="both"/>
-      </w:pPr>
-      <w:r>
-        <w:t xml:space="preserve">    };</w:t>
-      </w:r>
-    </w:p>
-    <w:p>
-      <w:pPr>
-        <w:spacing w:line="240" w:lineRule="auto"/>
-        <w:jc w:val="both"/>
-      </w:pPr>
-      <w:r>
-        <w:t>}</w:t>
-      </w:r>
-    </w:p>
-    <w:p>
-      <w:pPr>
-        <w:spacing w:line="240" w:lineRule="auto"/>
-        <w:jc w:val="both"/>
-      </w:pPr>
-    </w:p>
-    <w:p>
-      <w:pPr>
-        <w:spacing w:line="240" w:lineRule="auto"/>
-        <w:jc w:val="both"/>
-      </w:pPr>
-      <w:r>
-        <w:t>function square(</w:t>
-      </w:r>
-      <w:proofErr w:type="spellStart"/>
-      <w:r>
-        <w:t>num</w:t>
-      </w:r>
-      <w:proofErr w:type="spellEnd"/>
-      <w:r>
-        <w:t>) {</w:t>
-      </w:r>
-    </w:p>
-    <w:p>
-      <w:pPr>
-        <w:spacing w:line="240" w:lineRule="auto"/>
-        <w:jc w:val="both"/>
-      </w:pPr>
-      <w:r>
-        <w:t xml:space="preserve">    </w:t>
-      </w:r>
-      <w:proofErr w:type="gramStart"/>
-      <w:r>
-        <w:t>console.log(</w:t>
-      </w:r>
-      <w:proofErr w:type="gramEnd"/>
-      <w:r>
-        <w:t>"Calculating...");</w:t>
-      </w:r>
-    </w:p>
-    <w:p>
-      <w:pPr>
-        <w:spacing w:line="240" w:lineRule="auto"/>
-        <w:jc w:val="both"/>
-      </w:pPr>
-      <w:r>
-        <w:t xml:space="preserve">    return </w:t>
-      </w:r>
-      <w:proofErr w:type="spellStart"/>
-      <w:r>
-        <w:t>num</w:t>
-      </w:r>
-      <w:proofErr w:type="spellEnd"/>
-      <w:r>
-        <w:t xml:space="preserve"> * </w:t>
-      </w:r>
-      <w:proofErr w:type="spellStart"/>
-      <w:r>
-        <w:t>num</w:t>
-      </w:r>
-      <w:proofErr w:type="spellEnd"/>
-      <w:r>
-        <w:t>;</w:t>
-      </w:r>
-    </w:p>
-    <w:p>
-      <w:pPr>
-        <w:spacing w:line="240" w:lineRule="auto"/>
-        <w:jc w:val="both"/>
-      </w:pPr>
-      <w:r>
-        <w:t>}</w:t>
-      </w:r>
-    </w:p>
-    <w:p>
-      <w:pPr>
-        <w:spacing w:line="240" w:lineRule="auto"/>
-        <w:jc w:val="both"/>
-      </w:pPr>
-    </w:p>
-    <w:p>
-      <w:pPr>
-        <w:spacing w:line="240" w:lineRule="auto"/>
-        <w:jc w:val="both"/>
-      </w:pPr>
-      <w:proofErr w:type="spellStart"/>
-      <w:r>
-        <w:t>const</w:t>
-      </w:r>
-      <w:proofErr w:type="spellEnd"/>
-      <w:r>
-        <w:t xml:space="preserve"> </w:t>
-      </w:r>
-      <w:proofErr w:type="spellStart"/>
-      <w:r>
-        <w:t>memoizedSquare</w:t>
-      </w:r>
-      <w:proofErr w:type="spellEnd"/>
-      <w:r>
-        <w:t xml:space="preserve"> = </w:t>
-      </w:r>
-      <w:proofErr w:type="spellStart"/>
-      <w:r>
-        <w:t>memoize</w:t>
-      </w:r>
-      <w:proofErr w:type="spellEnd"/>
-      <w:r>
-        <w:t>(square);</w:t>
-      </w:r>
-    </w:p>
-    <w:p>
-      <w:pPr>
-        <w:spacing w:line="240" w:lineRule="auto"/>
-        <w:jc w:val="both"/>
-      </w:pPr>
-    </w:p>
-    <w:p>
-      <w:pPr>
-        <w:spacing w:line="240" w:lineRule="auto"/>
-        <w:jc w:val="both"/>
-      </w:pPr>
-      <w:r>
-        <w:t>console.log(</w:t>
-      </w:r>
-      <w:proofErr w:type="spellStart"/>
-      <w:proofErr w:type="gramStart"/>
-      <w:r>
-        <w:t>memoizedSquare</w:t>
-      </w:r>
-      <w:proofErr w:type="spellEnd"/>
-      <w:r>
-        <w:t>(</w:t>
-      </w:r>
-      <w:proofErr w:type="gramEnd"/>
-      <w:r>
-        <w:t>5));</w:t>
-      </w:r>
-    </w:p>
-    <w:p>
-      <w:pPr>
-        <w:spacing w:line="240" w:lineRule="auto"/>
-        <w:jc w:val="both"/>
-      </w:pPr>
-      <w:r>
-        <w:t>console.log(</w:t>
-      </w:r>
-      <w:proofErr w:type="spellStart"/>
-      <w:proofErr w:type="gramStart"/>
-      <w:r>
-        <w:t>memoizedSquare</w:t>
-      </w:r>
-      <w:proofErr w:type="spellEnd"/>
-      <w:r>
-        <w:t>(</w:t>
-      </w:r>
-      <w:proofErr w:type="gramEnd"/>
-      <w:r>
-        <w:t>5));</w:t>
-      </w:r>
-    </w:p>
-    <w:p>
-      <w:pPr>
-        <w:spacing w:line="240" w:lineRule="auto"/>
-        <w:jc w:val="both"/>
-      </w:pPr>
-      <w:r>
-        <w:t>The second call can use the cached result.</w:t>
-      </w:r>
-    </w:p>
-    <w:p>
-      <w:pPr>
-        <w:spacing w:line="240" w:lineRule="auto"/>
-        <w:jc w:val="both"/>
-      </w:pPr>
-      <w:r>
-        <w:rPr>
-          <w:b/>
-          <w:bCs/>
-        </w:rPr>
-        <w:t>Interview Answer:</w:t>
-      </w:r>
-    </w:p>
-    <w:p>
-      <w:pPr>
-        <w:spacing w:line="240" w:lineRule="auto"/>
-        <w:jc w:val="both"/>
-      </w:pPr>
-      <w:proofErr w:type="spellStart"/>
-      <w:r>
-        <w:t>Memoization</w:t>
-      </w:r>
-      <w:proofErr w:type="spellEnd"/>
-      <w:r>
         <w:t xml:space="preserve"> stores previously calculated results so that repeated calls with the same input can execute faster.</w:t>
       </w:r>
     </w:p>
@@ -7911,7 +7901,7 @@
       </w:pPr>
       <w:r>
         <w:pict w14:anchorId="0A63A1FD">
-          <v:rect id="_x0000_i1109" style="width:0;height:1.5pt" o:hralign="center" o:hrstd="t" o:hr="t" fillcolor="#a0a0a0" stroked="f"/>
+          <v:rect id="_x0000_i1049" style="width:0;height:1.5pt" o:hralign="center" o:hrstd="t" o:hr="t" fillcolor="#a0a0a0" stroked="f"/>
         </w:pict>
       </w:r>
     </w:p>
@@ -7929,7 +7919,6 @@
           <w:b/>
           <w:bCs/>
         </w:rPr>
-        <w:lastRenderedPageBreak/>
         <w:t xml:space="preserve">27. What is Optional Chaining </w:t>
       </w:r>
       <w:proofErr w:type="gramStart"/>
@@ -8124,7 +8113,7 @@
       </w:pPr>
       <w:r>
         <w:pict w14:anchorId="2B4A1B70">
-          <v:rect id="_x0000_i1110" style="width:0;height:1.5pt" o:hralign="center" o:hrstd="t" o:hr="t" fillcolor="#a0a0a0" stroked="f"/>
+          <v:rect id="_x0000_i1050" style="width:0;height:1.5pt" o:hralign="center" o:hrstd="t" o:hr="t" fillcolor="#a0a0a0" stroked="f"/>
         </w:pict>
       </w:r>
     </w:p>
@@ -8301,123 +8290,123 @@
         <w:jc w:val="both"/>
       </w:pPr>
       <w:r>
+        <w:t xml:space="preserve">|| treats values such as 0, "", and false as </w:t>
+      </w:r>
+      <w:proofErr w:type="spellStart"/>
+      <w:r>
+        <w:t>falsy</w:t>
+      </w:r>
+      <w:proofErr w:type="spellEnd"/>
+      <w:r>
+        <w:t>, while ?? only checks null and undefined.</w:t>
+      </w:r>
+    </w:p>
+    <w:p>
+      <w:pPr>
+        <w:spacing w:line="240" w:lineRule="auto"/>
+        <w:jc w:val="both"/>
+      </w:pPr>
+      <w:r>
+        <w:rPr>
+          <w:b/>
+          <w:bCs/>
+        </w:rPr>
+        <w:t>Interview Answer:</w:t>
+      </w:r>
+    </w:p>
+    <w:p>
+      <w:pPr>
+        <w:spacing w:line="240" w:lineRule="auto"/>
+        <w:jc w:val="both"/>
+      </w:pPr>
+      <w:r>
+        <w:t xml:space="preserve">The </w:t>
+      </w:r>
+      <w:proofErr w:type="spellStart"/>
+      <w:r>
+        <w:t>nullish</w:t>
+      </w:r>
+      <w:proofErr w:type="spellEnd"/>
+      <w:r>
+        <w:t xml:space="preserve"> coalescing operator returns the right-hand value only when the left-hand value is null or undefined.</w:t>
+      </w:r>
+    </w:p>
+    <w:p>
+      <w:pPr>
+        <w:spacing w:line="240" w:lineRule="auto"/>
+        <w:jc w:val="both"/>
+      </w:pPr>
+      <w:r>
+        <w:pict w14:anchorId="550B57D3">
+          <v:rect id="_x0000_i1051" style="width:0;height:1.5pt" o:hralign="center" o:hrstd="t" o:hr="t" fillcolor="#a0a0a0" stroked="f"/>
+        </w:pict>
+      </w:r>
+    </w:p>
+    <w:p>
+      <w:pPr>
+        <w:spacing w:line="240" w:lineRule="auto"/>
+        <w:jc w:val="both"/>
+        <w:rPr>
+          <w:b/>
+          <w:bCs/>
+        </w:rPr>
+      </w:pPr>
+      <w:r>
+        <w:rPr>
+          <w:b/>
+          <w:bCs/>
+        </w:rPr>
+        <w:t xml:space="preserve">29. What is the difference between </w:t>
+      </w:r>
+      <w:proofErr w:type="spellStart"/>
+      <w:r>
+        <w:rPr>
+          <w:b/>
+          <w:bCs/>
+        </w:rPr>
+        <w:t>Object.freeze</w:t>
+      </w:r>
+      <w:proofErr w:type="spellEnd"/>
+      <w:r>
+        <w:rPr>
+          <w:b/>
+          <w:bCs/>
+        </w:rPr>
+        <w:t xml:space="preserve">() and </w:t>
+      </w:r>
+      <w:proofErr w:type="spellStart"/>
+      <w:r>
+        <w:rPr>
+          <w:b/>
+          <w:bCs/>
+        </w:rPr>
+        <w:t>Object.seal</w:t>
+      </w:r>
+      <w:proofErr w:type="spellEnd"/>
+      <w:r>
+        <w:rPr>
+          <w:b/>
+          <w:bCs/>
+        </w:rPr>
+        <w:t>()?</w:t>
+      </w:r>
+    </w:p>
+    <w:p>
+      <w:pPr>
+        <w:spacing w:line="240" w:lineRule="auto"/>
+        <w:jc w:val="both"/>
+        <w:rPr>
+          <w:b/>
+          <w:bCs/>
+        </w:rPr>
+      </w:pPr>
+      <w:proofErr w:type="spellStart"/>
+      <w:r>
+        <w:rPr>
+          <w:b/>
+          <w:bCs/>
+        </w:rPr>
         <w:lastRenderedPageBreak/>
-        <w:t xml:space="preserve">|| treats values such as 0, "", and false as </w:t>
-      </w:r>
-      <w:proofErr w:type="spellStart"/>
-      <w:r>
-        <w:t>falsy</w:t>
-      </w:r>
-      <w:proofErr w:type="spellEnd"/>
-      <w:r>
-        <w:t>, while ?? only checks null and undefined.</w:t>
-      </w:r>
-    </w:p>
-    <w:p>
-      <w:pPr>
-        <w:spacing w:line="240" w:lineRule="auto"/>
-        <w:jc w:val="both"/>
-      </w:pPr>
-      <w:r>
-        <w:rPr>
-          <w:b/>
-          <w:bCs/>
-        </w:rPr>
-        <w:t>Interview Answer:</w:t>
-      </w:r>
-    </w:p>
-    <w:p>
-      <w:pPr>
-        <w:spacing w:line="240" w:lineRule="auto"/>
-        <w:jc w:val="both"/>
-      </w:pPr>
-      <w:r>
-        <w:t xml:space="preserve">The </w:t>
-      </w:r>
-      <w:proofErr w:type="spellStart"/>
-      <w:r>
-        <w:t>nullish</w:t>
-      </w:r>
-      <w:proofErr w:type="spellEnd"/>
-      <w:r>
-        <w:t xml:space="preserve"> coalescing operator returns the right-hand value only when the left-hand value is null or undefined.</w:t>
-      </w:r>
-    </w:p>
-    <w:p>
-      <w:pPr>
-        <w:spacing w:line="240" w:lineRule="auto"/>
-        <w:jc w:val="both"/>
-      </w:pPr>
-      <w:r>
-        <w:pict w14:anchorId="550B57D3">
-          <v:rect id="_x0000_i1111" style="width:0;height:1.5pt" o:hralign="center" o:hrstd="t" o:hr="t" fillcolor="#a0a0a0" stroked="f"/>
-        </w:pict>
-      </w:r>
-    </w:p>
-    <w:p>
-      <w:pPr>
-        <w:spacing w:line="240" w:lineRule="auto"/>
-        <w:jc w:val="both"/>
-        <w:rPr>
-          <w:b/>
-          <w:bCs/>
-        </w:rPr>
-      </w:pPr>
-      <w:r>
-        <w:rPr>
-          <w:b/>
-          <w:bCs/>
-        </w:rPr>
-        <w:t xml:space="preserve">29. What is the difference between </w:t>
-      </w:r>
-      <w:proofErr w:type="spellStart"/>
-      <w:r>
-        <w:rPr>
-          <w:b/>
-          <w:bCs/>
-        </w:rPr>
-        <w:t>Object.freeze</w:t>
-      </w:r>
-      <w:proofErr w:type="spellEnd"/>
-      <w:r>
-        <w:rPr>
-          <w:b/>
-          <w:bCs/>
-        </w:rPr>
-        <w:t xml:space="preserve">() and </w:t>
-      </w:r>
-      <w:proofErr w:type="spellStart"/>
-      <w:r>
-        <w:rPr>
-          <w:b/>
-          <w:bCs/>
-        </w:rPr>
-        <w:t>Object.seal</w:t>
-      </w:r>
-      <w:proofErr w:type="spellEnd"/>
-      <w:r>
-        <w:rPr>
-          <w:b/>
-          <w:bCs/>
-        </w:rPr>
-        <w:t>()?</w:t>
-      </w:r>
-    </w:p>
-    <w:p>
-      <w:pPr>
-        <w:spacing w:line="240" w:lineRule="auto"/>
-        <w:jc w:val="both"/>
-        <w:rPr>
-          <w:b/>
-          <w:bCs/>
-        </w:rPr>
-      </w:pPr>
-      <w:proofErr w:type="spellStart"/>
-      <w:r>
-        <w:rPr>
-          <w:b/>
-          <w:bCs/>
-        </w:rPr>
         <w:t>Object.freeze</w:t>
       </w:r>
       <w:proofErr w:type="spellEnd"/>
@@ -8749,6 +8738,7 @@
       </w:pPr>
       <w:proofErr w:type="spellStart"/>
       <w:r>
+        <w:lastRenderedPageBreak/>
         <w:t>Object.freeze</w:t>
       </w:r>
       <w:proofErr w:type="spellEnd"/>
@@ -8771,7 +8761,7 @@
       </w:pPr>
       <w:r>
         <w:pict w14:anchorId="2F352613">
-          <v:rect id="_x0000_i1112" style="width:0;height:1.5pt" o:hralign="center" o:hrstd="t" o:hr="t" fillcolor="#a0a0a0" stroked="f"/>
+          <v:rect id="_x0000_i1052" style="width:0;height:1.5pt" o:hralign="center" o:hrstd="t" o:hr="t" fillcolor="#a0a0a0" stroked="f"/>
         </w:pict>
       </w:r>
     </w:p>
@@ -9035,7 +9025,6 @@
         <w:jc w:val="both"/>
       </w:pPr>
       <w:r>
-        <w:lastRenderedPageBreak/>
         <w:t>JavaScript modules allow us to organize code into separate files and export and import functionality between them.</w:t>
       </w:r>
     </w:p>
@@ -9046,7 +9035,7 @@
       </w:pPr>
       <w:r>
         <w:pict w14:anchorId="25027A60">
-          <v:rect id="_x0000_i1113" style="width:0;height:1.5pt" o:hralign="center" o:hrstd="t" o:hr="t" fillcolor="#a0a0a0" stroked="f"/>
+          <v:rect id="_x0000_i1053" style="width:0;height:1.5pt" o:hralign="center" o:hrstd="t" o:hr="t" fillcolor="#a0a0a0" stroked="f"/>
         </w:pict>
       </w:r>
     </w:p>
@@ -12988,6 +12977,7 @@
   <w:style w:type="character" w:default="1" w:styleId="DefaultParagraphFont">
     <w:name w:val="Default Paragraph Font"/>
     <w:uiPriority w:val="1"/>
+    <w:semiHidden/>
     <w:unhideWhenUsed/>
   </w:style>
   <w:style w:type="table" w:default="1" w:styleId="TableNormal">

</xml_diff>